<commit_message>
Intelex TDM: rescored 56 after Agile/Scrum, Jira, engineering-liaison confirmations; profile updated
Co-Authored-By: Claude Opus 5.5 <noreply@anthropic.com>
Claude-Session: https://claude.ai/code/session_01Tym7Ffe6DkggR3nyAN5h24
</commit_message>
<xml_diff>
--- a/applications/intelex-technical-delivery-manager/Intelex-TechnicalDeliveryManager-Resume.docx
+++ b/applications/intelex-technical-delivery-manager/Intelex-TechnicalDeliveryManager-Resume.docx
@@ -80,7 +80,7 @@
           <w:i w:val="0"/>
           <w:color w:val="1A1A1A"/>
         </w:rPr>
-        <w:t>SaaS delivery and implementation lead with 15+ years translating business needs into technical requirements, sequencing the work, and getting it delivered across teams. I built sequenced implementation plans at Accelo, led a team of 20 (later 8) delivering 25+ launches a month at Wix, and today build production integrations and automation myself, so I can talk tradeoffs with engineers and explain them to leadership in plain language. Working SQL, Jira, and Power BI; Denver-based.</w:t>
+        <w:t>SaaS delivery and implementation lead with 15+ years translating business needs into technical requirements, sequencing the work, and getting it delivered across teams. I built sequenced implementation plans at Accelo, led a team of 20 (later 8) delivering 25+ launches a month at Wix, and today build production integrations and automation myself, so I can talk tradeoffs with engineers and explain them to leadership in plain language. Experienced in Agile/Scrum, Jira, SQL, and Power BI; Denver-based.</w:t>
       </w:r>
     </w:p>
     <w:p>
@@ -381,7 +381,7 @@
           <w:i w:val="0"/>
           <w:color w:val="1A1A1A"/>
         </w:rPr>
-        <w:t>Collaborated with Product and Engineering, turning partner feedback into structured, prioritized input for the roadmap.</w:t>
+        <w:t>Bridged 15-20 reseller partners and Product and Engineering as liaison, turning field feedback into structured, prioritized requirements for the roadmap; retained all but one partner (~94%).</w:t>
       </w:r>
     </w:p>
     <w:p>
@@ -705,7 +705,7 @@
           <w:i w:val="0"/>
           <w:color w:val="1A1A1A"/>
         </w:rPr>
-        <w:t>Requirements &amp; Acceptance Criteria, Backlog Prioritization, Dependency &amp; Risk Tracking, Stakeholder Communication, Implementation Planning</w:t>
+        <w:t>Agile / Scrum, Requirements &amp; Acceptance Criteria, Prioritization, Dependency &amp; Risk Tracking, Stakeholder Communication, Implementation Planning</w:t>
       </w:r>
     </w:p>
     <w:p>

</xml_diff>